<commit_message>
Update GRC Risk Assessment Report
</commit_message>
<xml_diff>
--- a/DHI_Risk_Assessment_Report.docx
+++ b/DHI_Risk_Assessment_Report.docx
@@ -558,6 +558,15 @@
         </w:rPr>
         <w:t xml:space="preserve"> RECOMMENDATIONS ---------------------------------------------------------------- 6</w:t>
       </w:r>
+      <w:r>
+        <w:rPr>
+          <w:rFonts w:ascii="Times New Roman" w:hAnsi="Times New Roman" w:cs="Times New Roman"/>
+          <w:color w:val="000000" w:themeColor="text1"/>
+          <w:sz w:val="24"/>
+          <w:szCs w:val="24"/>
+        </w:rPr>
+        <w:t>-7</w:t>
+      </w:r>
     </w:p>
     <w:p>
       <w:pPr>
@@ -709,7 +718,55 @@
           <w:sz w:val="24"/>
           <w:szCs w:val="24"/>
         </w:rPr>
-        <w:t>Currently, both teachers and students use shared computers to access the DHI portal. In many cases, teachers save their login passwords in web browsers for convenience. Because the same computers are later used by students, there is a possibility that saved passwords may be viewed or misused.</w:t>
+        <w:t>Currently, both teachers and students use</w:t>
+      </w:r>
+      <w:r>
+        <w:rPr>
+          <w:rFonts w:ascii="Times New Roman" w:hAnsi="Times New Roman" w:cs="Times New Roman"/>
+          <w:sz w:val="24"/>
+          <w:szCs w:val="24"/>
+        </w:rPr>
+        <w:t xml:space="preserve"> their mobiles and even</w:t>
+      </w:r>
+      <w:r>
+        <w:rPr>
+          <w:rFonts w:ascii="Times New Roman" w:hAnsi="Times New Roman" w:cs="Times New Roman"/>
+          <w:sz w:val="24"/>
+          <w:szCs w:val="24"/>
+        </w:rPr>
+        <w:t xml:space="preserve"> shared computers</w:t>
+      </w:r>
+      <w:r>
+        <w:rPr>
+          <w:rFonts w:ascii="Times New Roman" w:hAnsi="Times New Roman" w:cs="Times New Roman"/>
+          <w:sz w:val="24"/>
+          <w:szCs w:val="24"/>
+        </w:rPr>
+        <w:t xml:space="preserve"> in lab</w:t>
+      </w:r>
+      <w:r>
+        <w:rPr>
+          <w:rFonts w:ascii="Times New Roman" w:hAnsi="Times New Roman" w:cs="Times New Roman"/>
+          <w:sz w:val="24"/>
+          <w:szCs w:val="24"/>
+        </w:rPr>
+        <w:t xml:space="preserve"> to access the DHI portal. In many cases, teachers save their login passwords in web browsers</w:t>
+      </w:r>
+      <w:r>
+        <w:rPr>
+          <w:rFonts w:ascii="Times New Roman" w:hAnsi="Times New Roman" w:cs="Times New Roman"/>
+          <w:sz w:val="24"/>
+          <w:szCs w:val="24"/>
+        </w:rPr>
+        <w:t xml:space="preserve"> in lab computers</w:t>
+      </w:r>
+      <w:r>
+        <w:rPr>
+          <w:rFonts w:ascii="Times New Roman" w:hAnsi="Times New Roman" w:cs="Times New Roman"/>
+          <w:sz w:val="24"/>
+          <w:szCs w:val="24"/>
+        </w:rPr>
+        <w:t xml:space="preserve"> for convenience. Because the same computers are later used by students, there is a possibility that saved passwords may be viewed or misused.</w:t>
       </w:r>
     </w:p>
     <w:p>
@@ -1280,10 +1337,7 @@
         <w:jc w:val="both"/>
       </w:pPr>
       <w:r>
-        <w:t xml:space="preserve">Weak Authentication - </w:t>
-      </w:r>
-      <w:r>
-        <w:t>The portal currently depends only on passwords for authentication. Without additional security layers like MFA, accounts become easier to compromise if passwords are leaked.</w:t>
+        <w:t>Weak Authentication - The portal currently depends only on passwords for authentication. Without additional security layers like MFA, accounts become easier to compromise if passwords are leaked.</w:t>
       </w:r>
     </w:p>
     <w:p>
@@ -1303,37 +1357,10 @@
         <w:t>5. Risk Register</w:t>
       </w:r>
     </w:p>
-    <w:p>
-      <w:pPr>
-        <w:spacing w:before="80" w:after="80"/>
-        <w:rPr>
-          <w:rFonts w:ascii="Times New Roman" w:hAnsi="Times New Roman" w:cs="Times New Roman"/>
-          <w:sz w:val="24"/>
-          <w:szCs w:val="24"/>
-        </w:rPr>
-      </w:pPr>
-      <w:r>
-        <w:rPr>
-          <w:rFonts w:ascii="Times New Roman" w:hAnsi="Times New Roman" w:cs="Times New Roman"/>
-          <w:sz w:val="24"/>
-          <w:szCs w:val="24"/>
-        </w:rPr>
-        <w:t>The table below presents identified risks with their associated assets, root causes, impact, likelihood, current controls, and recommended mitigations.</w:t>
-      </w:r>
-    </w:p>
-    <w:p>
-      <w:pPr>
-        <w:spacing w:before="60" w:after="60"/>
-        <w:rPr>
-          <w:rFonts w:ascii="Times New Roman" w:hAnsi="Times New Roman" w:cs="Times New Roman"/>
-          <w:sz w:val="24"/>
-          <w:szCs w:val="24"/>
-        </w:rPr>
-      </w:pPr>
-    </w:p>
     <w:tbl>
       <w:tblPr>
-        <w:tblW w:w="10260" w:type="dxa"/>
+        <w:tblpPr w:leftFromText="180" w:rightFromText="180" w:vertAnchor="text" w:horzAnchor="margin" w:tblpXSpec="center" w:tblpY="1038"/>
+        <w:tblW w:w="11323" w:type="dxa"/>
         <w:tblBorders>
           <w:top w:val="single" w:sz="4" w:space="0" w:color="auto"/>
           <w:left w:val="single" w:sz="4" w:space="0" w:color="auto"/>
@@ -1360,18 +1387,12 @@
         <w:gridCol w:w="2000"/>
       </w:tblGrid>
       <w:tr>
-        <w:tblPrEx>
-          <w:tblCellMar>
-            <w:top w:w="0" w:type="dxa"/>
-            <w:bottom w:w="0" w:type="dxa"/>
-          </w:tblCellMar>
-        </w:tblPrEx>
         <w:trPr>
           <w:tblHeader/>
         </w:trPr>
         <w:tc>
           <w:tcPr>
-            <w:tcW w:w="636" w:type="dxa"/>
+            <w:tcW w:w="667" w:type="dxa"/>
             <w:tcBorders>
               <w:top w:val="single" w:sz="1" w:space="0" w:color="1E3A5F"/>
               <w:left w:val="single" w:sz="1" w:space="0" w:color="1E3A5F"/>
@@ -1411,7 +1432,7 @@
         </w:tc>
         <w:tc>
           <w:tcPr>
-            <w:tcW w:w="1315" w:type="dxa"/>
+            <w:tcW w:w="1293" w:type="dxa"/>
             <w:tcBorders>
               <w:top w:val="single" w:sz="1" w:space="0" w:color="1E3A5F"/>
               <w:left w:val="single" w:sz="1" w:space="0" w:color="1E3A5F"/>
@@ -1451,7 +1472,7 @@
         </w:tc>
         <w:tc>
           <w:tcPr>
-            <w:tcW w:w="1429" w:type="dxa"/>
+            <w:tcW w:w="1453" w:type="dxa"/>
             <w:tcBorders>
               <w:top w:val="single" w:sz="1" w:space="0" w:color="1E3A5F"/>
               <w:left w:val="single" w:sz="1" w:space="0" w:color="1E3A5F"/>
@@ -1491,7 +1512,7 @@
         </w:tc>
         <w:tc>
           <w:tcPr>
-            <w:tcW w:w="1259" w:type="dxa"/>
+            <w:tcW w:w="1560" w:type="dxa"/>
             <w:tcBorders>
               <w:top w:val="single" w:sz="1" w:space="0" w:color="1E3A5F"/>
               <w:left w:val="single" w:sz="1" w:space="0" w:color="1E3A5F"/>
@@ -1531,7 +1552,7 @@
         </w:tc>
         <w:tc>
           <w:tcPr>
-            <w:tcW w:w="805" w:type="dxa"/>
+            <w:tcW w:w="934" w:type="dxa"/>
             <w:tcBorders>
               <w:top w:val="single" w:sz="1" w:space="0" w:color="1E3A5F"/>
               <w:left w:val="single" w:sz="1" w:space="0" w:color="1E3A5F"/>
@@ -1571,7 +1592,7 @@
         </w:tc>
         <w:tc>
           <w:tcPr>
-            <w:tcW w:w="1100" w:type="dxa"/>
+            <w:tcW w:w="1308" w:type="dxa"/>
             <w:tcBorders>
               <w:top w:val="single" w:sz="1" w:space="0" w:color="1E3A5F"/>
               <w:left w:val="single" w:sz="1" w:space="0" w:color="1E3A5F"/>
@@ -1611,7 +1632,7 @@
         </w:tc>
         <w:tc>
           <w:tcPr>
-            <w:tcW w:w="870" w:type="dxa"/>
+            <w:tcW w:w="987" w:type="dxa"/>
             <w:tcBorders>
               <w:top w:val="single" w:sz="1" w:space="0" w:color="1E3A5F"/>
               <w:left w:val="single" w:sz="1" w:space="0" w:color="1E3A5F"/>
@@ -1651,7 +1672,7 @@
         </w:tc>
         <w:tc>
           <w:tcPr>
-            <w:tcW w:w="1019" w:type="dxa"/>
+            <w:tcW w:w="1121" w:type="dxa"/>
             <w:tcBorders>
               <w:top w:val="single" w:sz="1" w:space="0" w:color="1E3A5F"/>
               <w:left w:val="single" w:sz="1" w:space="0" w:color="1E3A5F"/>
@@ -1691,7 +1712,7 @@
         </w:tc>
         <w:tc>
           <w:tcPr>
-            <w:tcW w:w="1827" w:type="dxa"/>
+            <w:tcW w:w="2000" w:type="dxa"/>
             <w:tcBorders>
               <w:top w:val="single" w:sz="1" w:space="0" w:color="1E3A5F"/>
               <w:left w:val="single" w:sz="1" w:space="0" w:color="1E3A5F"/>
@@ -1731,15 +1752,9 @@
         </w:tc>
       </w:tr>
       <w:tr>
-        <w:tblPrEx>
-          <w:tblCellMar>
-            <w:top w:w="0" w:type="dxa"/>
-            <w:bottom w:w="0" w:type="dxa"/>
-          </w:tblCellMar>
-        </w:tblPrEx>
         <w:tc>
           <w:tcPr>
-            <w:tcW w:w="636" w:type="dxa"/>
+            <w:tcW w:w="667" w:type="dxa"/>
             <w:tcBorders>
               <w:top w:val="single" w:sz="1" w:space="0" w:color="1E3A5F"/>
               <w:left w:val="single" w:sz="1" w:space="0" w:color="1E3A5F"/>
@@ -1778,7 +1793,7 @@
         </w:tc>
         <w:tc>
           <w:tcPr>
-            <w:tcW w:w="1315" w:type="dxa"/>
+            <w:tcW w:w="1293" w:type="dxa"/>
             <w:tcBorders>
               <w:top w:val="single" w:sz="1" w:space="0" w:color="1E3A5F"/>
               <w:left w:val="single" w:sz="1" w:space="0" w:color="1E3A5F"/>
@@ -1815,7 +1830,7 @@
         </w:tc>
         <w:tc>
           <w:tcPr>
-            <w:tcW w:w="1429" w:type="dxa"/>
+            <w:tcW w:w="1453" w:type="dxa"/>
             <w:tcBorders>
               <w:top w:val="single" w:sz="1" w:space="0" w:color="1E3A5F"/>
               <w:left w:val="single" w:sz="1" w:space="0" w:color="1E3A5F"/>
@@ -1852,7 +1867,7 @@
         </w:tc>
         <w:tc>
           <w:tcPr>
-            <w:tcW w:w="1259" w:type="dxa"/>
+            <w:tcW w:w="1560" w:type="dxa"/>
             <w:tcBorders>
               <w:top w:val="single" w:sz="1" w:space="0" w:color="1E3A5F"/>
               <w:left w:val="single" w:sz="1" w:space="0" w:color="1E3A5F"/>
@@ -1889,7 +1904,7 @@
         </w:tc>
         <w:tc>
           <w:tcPr>
-            <w:tcW w:w="805" w:type="dxa"/>
+            <w:tcW w:w="934" w:type="dxa"/>
             <w:tcBorders>
               <w:top w:val="single" w:sz="1" w:space="0" w:color="1E3A5F"/>
               <w:left w:val="single" w:sz="1" w:space="0" w:color="1E3A5F"/>
@@ -1926,7 +1941,7 @@
         </w:tc>
         <w:tc>
           <w:tcPr>
-            <w:tcW w:w="1100" w:type="dxa"/>
+            <w:tcW w:w="1308" w:type="dxa"/>
             <w:tcBorders>
               <w:top w:val="single" w:sz="1" w:space="0" w:color="1E3A5F"/>
               <w:left w:val="single" w:sz="1" w:space="0" w:color="1E3A5F"/>
@@ -1963,7 +1978,7 @@
         </w:tc>
         <w:tc>
           <w:tcPr>
-            <w:tcW w:w="870" w:type="dxa"/>
+            <w:tcW w:w="987" w:type="dxa"/>
             <w:tcBorders>
               <w:top w:val="single" w:sz="1" w:space="0" w:color="1E3A5F"/>
               <w:left w:val="single" w:sz="1" w:space="0" w:color="1E3A5F"/>
@@ -2003,7 +2018,7 @@
         </w:tc>
         <w:tc>
           <w:tcPr>
-            <w:tcW w:w="1019" w:type="dxa"/>
+            <w:tcW w:w="1121" w:type="dxa"/>
             <w:tcBorders>
               <w:top w:val="single" w:sz="1" w:space="0" w:color="1E3A5F"/>
               <w:left w:val="single" w:sz="1" w:space="0" w:color="1E3A5F"/>
@@ -2040,7 +2055,7 @@
         </w:tc>
         <w:tc>
           <w:tcPr>
-            <w:tcW w:w="1827" w:type="dxa"/>
+            <w:tcW w:w="2000" w:type="dxa"/>
             <w:tcBorders>
               <w:top w:val="single" w:sz="1" w:space="0" w:color="1E3A5F"/>
               <w:left w:val="single" w:sz="1" w:space="0" w:color="1E3A5F"/>
@@ -2077,15 +2092,9 @@
         </w:tc>
       </w:tr>
       <w:tr>
-        <w:tblPrEx>
-          <w:tblCellMar>
-            <w:top w:w="0" w:type="dxa"/>
-            <w:bottom w:w="0" w:type="dxa"/>
-          </w:tblCellMar>
-        </w:tblPrEx>
         <w:tc>
           <w:tcPr>
-            <w:tcW w:w="636" w:type="dxa"/>
+            <w:tcW w:w="667" w:type="dxa"/>
             <w:tcBorders>
               <w:top w:val="single" w:sz="1" w:space="0" w:color="1E3A5F"/>
               <w:left w:val="single" w:sz="1" w:space="0" w:color="1E3A5F"/>
@@ -2124,7 +2133,7 @@
         </w:tc>
         <w:tc>
           <w:tcPr>
-            <w:tcW w:w="1315" w:type="dxa"/>
+            <w:tcW w:w="1293" w:type="dxa"/>
             <w:tcBorders>
               <w:top w:val="single" w:sz="1" w:space="0" w:color="1E3A5F"/>
               <w:left w:val="single" w:sz="1" w:space="0" w:color="1E3A5F"/>
@@ -2161,7 +2170,7 @@
         </w:tc>
         <w:tc>
           <w:tcPr>
-            <w:tcW w:w="1429" w:type="dxa"/>
+            <w:tcW w:w="1453" w:type="dxa"/>
             <w:tcBorders>
               <w:top w:val="single" w:sz="1" w:space="0" w:color="1E3A5F"/>
               <w:left w:val="single" w:sz="1" w:space="0" w:color="1E3A5F"/>
@@ -2198,7 +2207,7 @@
         </w:tc>
         <w:tc>
           <w:tcPr>
-            <w:tcW w:w="1259" w:type="dxa"/>
+            <w:tcW w:w="1560" w:type="dxa"/>
             <w:tcBorders>
               <w:top w:val="single" w:sz="1" w:space="0" w:color="1E3A5F"/>
               <w:left w:val="single" w:sz="1" w:space="0" w:color="1E3A5F"/>
@@ -2235,7 +2244,7 @@
         </w:tc>
         <w:tc>
           <w:tcPr>
-            <w:tcW w:w="805" w:type="dxa"/>
+            <w:tcW w:w="934" w:type="dxa"/>
             <w:tcBorders>
               <w:top w:val="single" w:sz="1" w:space="0" w:color="1E3A5F"/>
               <w:left w:val="single" w:sz="1" w:space="0" w:color="1E3A5F"/>
@@ -2272,7 +2281,7 @@
         </w:tc>
         <w:tc>
           <w:tcPr>
-            <w:tcW w:w="1100" w:type="dxa"/>
+            <w:tcW w:w="1308" w:type="dxa"/>
             <w:tcBorders>
               <w:top w:val="single" w:sz="1" w:space="0" w:color="1E3A5F"/>
               <w:left w:val="single" w:sz="1" w:space="0" w:color="1E3A5F"/>
@@ -2309,7 +2318,7 @@
         </w:tc>
         <w:tc>
           <w:tcPr>
-            <w:tcW w:w="870" w:type="dxa"/>
+            <w:tcW w:w="987" w:type="dxa"/>
             <w:tcBorders>
               <w:top w:val="single" w:sz="1" w:space="0" w:color="1E3A5F"/>
               <w:left w:val="single" w:sz="1" w:space="0" w:color="1E3A5F"/>
@@ -2349,7 +2358,7 @@
         </w:tc>
         <w:tc>
           <w:tcPr>
-            <w:tcW w:w="1019" w:type="dxa"/>
+            <w:tcW w:w="1121" w:type="dxa"/>
             <w:tcBorders>
               <w:top w:val="single" w:sz="1" w:space="0" w:color="1E3A5F"/>
               <w:left w:val="single" w:sz="1" w:space="0" w:color="1E3A5F"/>
@@ -2386,7 +2395,7 @@
         </w:tc>
         <w:tc>
           <w:tcPr>
-            <w:tcW w:w="1827" w:type="dxa"/>
+            <w:tcW w:w="2000" w:type="dxa"/>
             <w:tcBorders>
               <w:top w:val="single" w:sz="1" w:space="0" w:color="1E3A5F"/>
               <w:left w:val="single" w:sz="1" w:space="0" w:color="1E3A5F"/>
@@ -2423,15 +2432,9 @@
         </w:tc>
       </w:tr>
       <w:tr>
-        <w:tblPrEx>
-          <w:tblCellMar>
-            <w:top w:w="0" w:type="dxa"/>
-            <w:bottom w:w="0" w:type="dxa"/>
-          </w:tblCellMar>
-        </w:tblPrEx>
         <w:tc>
           <w:tcPr>
-            <w:tcW w:w="636" w:type="dxa"/>
+            <w:tcW w:w="667" w:type="dxa"/>
             <w:tcBorders>
               <w:top w:val="single" w:sz="1" w:space="0" w:color="1E3A5F"/>
               <w:left w:val="single" w:sz="1" w:space="0" w:color="1E3A5F"/>
@@ -2470,7 +2473,7 @@
         </w:tc>
         <w:tc>
           <w:tcPr>
-            <w:tcW w:w="1315" w:type="dxa"/>
+            <w:tcW w:w="1293" w:type="dxa"/>
             <w:tcBorders>
               <w:top w:val="single" w:sz="1" w:space="0" w:color="1E3A5F"/>
               <w:left w:val="single" w:sz="1" w:space="0" w:color="1E3A5F"/>
@@ -2507,7 +2510,7 @@
         </w:tc>
         <w:tc>
           <w:tcPr>
-            <w:tcW w:w="1429" w:type="dxa"/>
+            <w:tcW w:w="1453" w:type="dxa"/>
             <w:tcBorders>
               <w:top w:val="single" w:sz="1" w:space="0" w:color="1E3A5F"/>
               <w:left w:val="single" w:sz="1" w:space="0" w:color="1E3A5F"/>
@@ -2544,7 +2547,7 @@
         </w:tc>
         <w:tc>
           <w:tcPr>
-            <w:tcW w:w="1259" w:type="dxa"/>
+            <w:tcW w:w="1560" w:type="dxa"/>
             <w:tcBorders>
               <w:top w:val="single" w:sz="1" w:space="0" w:color="1E3A5F"/>
               <w:left w:val="single" w:sz="1" w:space="0" w:color="1E3A5F"/>
@@ -2581,7 +2584,7 @@
         </w:tc>
         <w:tc>
           <w:tcPr>
-            <w:tcW w:w="805" w:type="dxa"/>
+            <w:tcW w:w="934" w:type="dxa"/>
             <w:tcBorders>
               <w:top w:val="single" w:sz="1" w:space="0" w:color="1E3A5F"/>
               <w:left w:val="single" w:sz="1" w:space="0" w:color="1E3A5F"/>
@@ -2618,7 +2621,7 @@
         </w:tc>
         <w:tc>
           <w:tcPr>
-            <w:tcW w:w="1100" w:type="dxa"/>
+            <w:tcW w:w="1308" w:type="dxa"/>
             <w:tcBorders>
               <w:top w:val="single" w:sz="1" w:space="0" w:color="1E3A5F"/>
               <w:left w:val="single" w:sz="1" w:space="0" w:color="1E3A5F"/>
@@ -2655,7 +2658,7 @@
         </w:tc>
         <w:tc>
           <w:tcPr>
-            <w:tcW w:w="870" w:type="dxa"/>
+            <w:tcW w:w="987" w:type="dxa"/>
             <w:tcBorders>
               <w:top w:val="single" w:sz="1" w:space="0" w:color="1E3A5F"/>
               <w:left w:val="single" w:sz="1" w:space="0" w:color="1E3A5F"/>
@@ -2695,7 +2698,7 @@
         </w:tc>
         <w:tc>
           <w:tcPr>
-            <w:tcW w:w="1019" w:type="dxa"/>
+            <w:tcW w:w="1121" w:type="dxa"/>
             <w:tcBorders>
               <w:top w:val="single" w:sz="1" w:space="0" w:color="1E3A5F"/>
               <w:left w:val="single" w:sz="1" w:space="0" w:color="1E3A5F"/>
@@ -2732,7 +2735,7 @@
         </w:tc>
         <w:tc>
           <w:tcPr>
-            <w:tcW w:w="1827" w:type="dxa"/>
+            <w:tcW w:w="2000" w:type="dxa"/>
             <w:tcBorders>
               <w:top w:val="single" w:sz="1" w:space="0" w:color="1E3A5F"/>
               <w:left w:val="single" w:sz="1" w:space="0" w:color="1E3A5F"/>
@@ -2769,6 +2772,34 @@
         </w:tc>
       </w:tr>
     </w:tbl>
+    <w:p>
+      <w:pPr>
+        <w:spacing w:before="80" w:after="80"/>
+        <w:rPr>
+          <w:rFonts w:ascii="Times New Roman" w:hAnsi="Times New Roman" w:cs="Times New Roman"/>
+          <w:sz w:val="24"/>
+          <w:szCs w:val="24"/>
+        </w:rPr>
+      </w:pPr>
+      <w:r>
+        <w:rPr>
+          <w:rFonts w:ascii="Times New Roman" w:hAnsi="Times New Roman" w:cs="Times New Roman"/>
+          <w:sz w:val="24"/>
+          <w:szCs w:val="24"/>
+        </w:rPr>
+        <w:t>The table below presents identified risks with their associated assets, root causes, impact, likelihood, current controls, and recommended mitigations.</w:t>
+      </w:r>
+    </w:p>
+    <w:p>
+      <w:pPr>
+        <w:spacing w:before="60" w:after="60"/>
+        <w:rPr>
+          <w:rFonts w:ascii="Times New Roman" w:hAnsi="Times New Roman" w:cs="Times New Roman"/>
+          <w:sz w:val="24"/>
+          <w:szCs w:val="24"/>
+        </w:rPr>
+      </w:pPr>
+    </w:p>
     <w:p>
       <w:pPr>
         <w:pStyle w:val="Heading1"/>
@@ -2838,12 +2869,6 @@
         <w:gridCol w:w="3120"/>
       </w:tblGrid>
       <w:tr>
-        <w:tblPrEx>
-          <w:tblCellMar>
-            <w:top w:w="0" w:type="dxa"/>
-            <w:bottom w:w="0" w:type="dxa"/>
-          </w:tblCellMar>
-        </w:tblPrEx>
         <w:tc>
           <w:tcPr>
             <w:tcW w:w="3120" w:type="dxa"/>
@@ -2966,12 +2991,6 @@
         </w:tc>
       </w:tr>
       <w:tr>
-        <w:tblPrEx>
-          <w:tblCellMar>
-            <w:top w:w="0" w:type="dxa"/>
-            <w:bottom w:w="0" w:type="dxa"/>
-          </w:tblCellMar>
-        </w:tblPrEx>
         <w:tc>
           <w:tcPr>
             <w:tcW w:w="3120" w:type="dxa"/>
@@ -3090,12 +3109,6 @@
         </w:tc>
       </w:tr>
       <w:tr>
-        <w:tblPrEx>
-          <w:tblCellMar>
-            <w:top w:w="0" w:type="dxa"/>
-            <w:bottom w:w="0" w:type="dxa"/>
-          </w:tblCellMar>
-        </w:tblPrEx>
         <w:tc>
           <w:tcPr>
             <w:tcW w:w="3120" w:type="dxa"/>
@@ -3214,12 +3227,6 @@
         </w:tc>
       </w:tr>
       <w:tr>
-        <w:tblPrEx>
-          <w:tblCellMar>
-            <w:top w:w="0" w:type="dxa"/>
-            <w:bottom w:w="0" w:type="dxa"/>
-          </w:tblCellMar>
-        </w:tblPrEx>
         <w:tc>
           <w:tcPr>
             <w:tcW w:w="3120" w:type="dxa"/>
@@ -3338,12 +3345,6 @@
         </w:tc>
       </w:tr>
       <w:tr>
-        <w:tblPrEx>
-          <w:tblCellMar>
-            <w:top w:w="0" w:type="dxa"/>
-            <w:bottom w:w="0" w:type="dxa"/>
-          </w:tblCellMar>
-        </w:tblPrEx>
         <w:tc>
           <w:tcPr>
             <w:tcW w:w="3120" w:type="dxa"/>
@@ -3644,10 +3645,27 @@
     </w:p>
     <w:p>
       <w:pPr>
-        <w:spacing w:before="80" w:after="80"/>
-      </w:pPr>
-      <w:r>
-        <w:t>Based on the risk analysis, the following security controls and improvements are strongly recommended:</w:t>
+        <w:pStyle w:val="Heading2"/>
+        <w:spacing w:line="276" w:lineRule="auto"/>
+        <w:rPr>
+          <w:rFonts w:ascii="Times New Roman" w:hAnsi="Times New Roman" w:cs="Times New Roman"/>
+          <w:b w:val="0"/>
+          <w:bCs w:val="0"/>
+          <w:color w:val="000000" w:themeColor="text1"/>
+          <w:sz w:val="24"/>
+          <w:szCs w:val="24"/>
+        </w:rPr>
+      </w:pPr>
+      <w:r>
+        <w:rPr>
+          <w:rFonts w:ascii="Times New Roman" w:hAnsi="Times New Roman" w:cs="Times New Roman"/>
+          <w:b w:val="0"/>
+          <w:bCs w:val="0"/>
+          <w:color w:val="000000" w:themeColor="text1"/>
+          <w:sz w:val="24"/>
+          <w:szCs w:val="24"/>
+        </w:rPr>
+        <w:t>The following recommendations are aligned with ISO 27001:2022 Annex A security controls, which provide an internationally recognised framework for managing information security risks. Each control has been selected based on the risks identified in the risk register.</w:t>
       </w:r>
     </w:p>
     <w:p>
@@ -3667,42 +3685,75 @@
         </w:rPr>
         <w:t>8.1 Implement Multi-Factor Authentication (MFA)</w:t>
       </w:r>
-    </w:p>
-    <w:p>
-      <w:pPr>
-        <w:spacing w:before="60" w:after="60"/>
-        <w:jc w:val="both"/>
-        <w:rPr>
-          <w:rFonts w:ascii="Times New Roman" w:hAnsi="Times New Roman" w:cs="Times New Roman"/>
-          <w:sz w:val="24"/>
-          <w:szCs w:val="24"/>
-        </w:rPr>
-      </w:pPr>
-      <w:r>
-        <w:rPr>
-          <w:rFonts w:ascii="Times New Roman" w:hAnsi="Times New Roman" w:cs="Times New Roman"/>
-          <w:sz w:val="24"/>
-          <w:szCs w:val="24"/>
-        </w:rPr>
-        <w:t>MFA adds an extra layer of security during login. Even if someone gets the password, they will still need another verification method, such as an OTP sent to a mobile device. This can greatly reduce unauthorized access.</w:t>
-      </w:r>
-    </w:p>
-    <w:p>
-      <w:pPr>
-        <w:pStyle w:val="Heading2"/>
+      <w:r>
         <w:rPr>
           <w:rFonts w:ascii="Times New Roman" w:hAnsi="Times New Roman" w:cs="Times New Roman"/>
           <w:sz w:val="28"/>
           <w:szCs w:val="28"/>
         </w:rPr>
-      </w:pPr>
+        <w:t xml:space="preserve"> </w:t>
+      </w:r>
       <w:r>
         <w:rPr>
           <w:rFonts w:ascii="Times New Roman" w:hAnsi="Times New Roman" w:cs="Times New Roman"/>
           <w:sz w:val="28"/>
           <w:szCs w:val="28"/>
         </w:rPr>
+        <w:t>ISO 27001 Annex A — A.9.4.2: Secure log-on procedures</w:t>
+      </w:r>
+    </w:p>
+    <w:p>
+      <w:pPr>
+        <w:spacing w:before="60" w:after="60" w:line="276" w:lineRule="auto"/>
+        <w:jc w:val="both"/>
+        <w:rPr>
+          <w:rFonts w:ascii="Times New Roman" w:hAnsi="Times New Roman" w:cs="Times New Roman"/>
+          <w:sz w:val="24"/>
+          <w:szCs w:val="24"/>
+        </w:rPr>
+      </w:pPr>
+      <w:r>
+        <w:rPr>
+          <w:rFonts w:ascii="Times New Roman" w:hAnsi="Times New Roman" w:cs="Times New Roman"/>
+          <w:sz w:val="24"/>
+          <w:szCs w:val="24"/>
+        </w:rPr>
+        <w:t>MFA adds an extra layer of security during login. Even if someone gets the password, they will still need another verification method, such as an OTP sent to a mobile device. This can greatly reduce unauthorized access.</w:t>
+      </w:r>
+    </w:p>
+    <w:p>
+      <w:pPr>
+        <w:pStyle w:val="Heading2"/>
+        <w:spacing w:line="276" w:lineRule="auto"/>
+        <w:rPr>
+          <w:rFonts w:ascii="Times New Roman" w:hAnsi="Times New Roman" w:cs="Times New Roman"/>
+          <w:sz w:val="28"/>
+          <w:szCs w:val="28"/>
+        </w:rPr>
+      </w:pPr>
+      <w:r>
+        <w:rPr>
+          <w:rFonts w:ascii="Times New Roman" w:hAnsi="Times New Roman" w:cs="Times New Roman"/>
+          <w:sz w:val="28"/>
+          <w:szCs w:val="28"/>
+        </w:rPr>
         <w:t>8.2 Enforce a Strong Password Policy</w:t>
+      </w:r>
+      <w:r>
+        <w:rPr>
+          <w:rFonts w:ascii="Times New Roman" w:hAnsi="Times New Roman" w:cs="Times New Roman"/>
+          <w:sz w:val="28"/>
+          <w:szCs w:val="28"/>
+        </w:rPr>
+        <w:t xml:space="preserve"> </w:t>
+      </w:r>
+      <w:r>
+        <w:rPr>
+          <w:rFonts w:ascii="Times New Roman" w:hAnsi="Times New Roman" w:cs="Times New Roman"/>
+          <w:sz w:val="28"/>
+          <w:szCs w:val="28"/>
+        </w:rPr>
+        <w:t>ISO 27001 Annex A — A.9.4.3: Password management system</w:t>
       </w:r>
     </w:p>
     <w:p>
@@ -3795,7 +3846,7 @@
     </w:p>
     <w:p>
       <w:pPr>
-        <w:spacing w:before="60" w:after="60"/>
+        <w:spacing w:before="60" w:after="60" w:line="276" w:lineRule="auto"/>
         <w:jc w:val="both"/>
         <w:rPr>
           <w:rFonts w:ascii="Times New Roman" w:hAnsi="Times New Roman" w:cs="Times New Roman"/>
@@ -3815,6 +3866,7 @@
     <w:p>
       <w:pPr>
         <w:pStyle w:val="Heading2"/>
+        <w:spacing w:line="276" w:lineRule="auto"/>
         <w:rPr>
           <w:rFonts w:ascii="Times New Roman" w:hAnsi="Times New Roman" w:cs="Times New Roman"/>
           <w:sz w:val="28"/>
@@ -3829,42 +3881,75 @@
         </w:rPr>
         <w:t>8.3 Configure Automatic Session Timeout</w:t>
       </w:r>
-    </w:p>
-    <w:p>
-      <w:pPr>
-        <w:spacing w:before="60" w:after="60"/>
-        <w:jc w:val="both"/>
-        <w:rPr>
-          <w:rFonts w:ascii="Times New Roman" w:hAnsi="Times New Roman" w:cs="Times New Roman"/>
-          <w:sz w:val="24"/>
-          <w:szCs w:val="24"/>
-        </w:rPr>
-      </w:pPr>
-      <w:r>
-        <w:rPr>
-          <w:rFonts w:ascii="Times New Roman" w:hAnsi="Times New Roman" w:cs="Times New Roman"/>
-          <w:sz w:val="24"/>
-          <w:szCs w:val="24"/>
-        </w:rPr>
-        <w:t>The portal should automatically log out users after a period of inactivity. This prevents others from accessing accounts left open on shared computers.</w:t>
-      </w:r>
-    </w:p>
-    <w:p>
-      <w:pPr>
-        <w:pStyle w:val="Heading2"/>
+      <w:r>
         <w:rPr>
           <w:rFonts w:ascii="Times New Roman" w:hAnsi="Times New Roman" w:cs="Times New Roman"/>
           <w:sz w:val="28"/>
           <w:szCs w:val="28"/>
         </w:rPr>
-      </w:pPr>
+        <w:t xml:space="preserve"> </w:t>
+      </w:r>
       <w:r>
         <w:rPr>
           <w:rFonts w:ascii="Times New Roman" w:hAnsi="Times New Roman" w:cs="Times New Roman"/>
           <w:sz w:val="28"/>
           <w:szCs w:val="28"/>
         </w:rPr>
+        <w:t>ISO 27001 Annex A — A.9.4.2: Secure log-on procedures</w:t>
+      </w:r>
+    </w:p>
+    <w:p>
+      <w:pPr>
+        <w:spacing w:before="60" w:after="60" w:line="276" w:lineRule="auto"/>
+        <w:jc w:val="both"/>
+        <w:rPr>
+          <w:rFonts w:ascii="Times New Roman" w:hAnsi="Times New Roman" w:cs="Times New Roman"/>
+          <w:sz w:val="24"/>
+          <w:szCs w:val="24"/>
+        </w:rPr>
+      </w:pPr>
+      <w:r>
+        <w:rPr>
+          <w:rFonts w:ascii="Times New Roman" w:hAnsi="Times New Roman" w:cs="Times New Roman"/>
+          <w:sz w:val="24"/>
+          <w:szCs w:val="24"/>
+        </w:rPr>
+        <w:t>The portal should automatically log out users after a period of inactivity. This prevents others from accessing accounts left open on shared computers.</w:t>
+      </w:r>
+    </w:p>
+    <w:p>
+      <w:pPr>
+        <w:pStyle w:val="Heading2"/>
+        <w:spacing w:line="276" w:lineRule="auto"/>
+        <w:rPr>
+          <w:rFonts w:ascii="Times New Roman" w:hAnsi="Times New Roman" w:cs="Times New Roman"/>
+          <w:sz w:val="28"/>
+          <w:szCs w:val="28"/>
+        </w:rPr>
+      </w:pPr>
+      <w:r>
+        <w:rPr>
+          <w:rFonts w:ascii="Times New Roman" w:hAnsi="Times New Roman" w:cs="Times New Roman"/>
+          <w:sz w:val="28"/>
+          <w:szCs w:val="28"/>
+        </w:rPr>
         <w:t>8.4 Implement Audit Logs</w:t>
+      </w:r>
+      <w:r>
+        <w:rPr>
+          <w:rFonts w:ascii="Times New Roman" w:hAnsi="Times New Roman" w:cs="Times New Roman"/>
+          <w:sz w:val="28"/>
+          <w:szCs w:val="28"/>
+        </w:rPr>
+        <w:t xml:space="preserve"> </w:t>
+      </w:r>
+      <w:r>
+        <w:rPr>
+          <w:rFonts w:ascii="Times New Roman" w:hAnsi="Times New Roman" w:cs="Times New Roman"/>
+          <w:sz w:val="28"/>
+          <w:szCs w:val="28"/>
+        </w:rPr>
+        <w:t>ISO 27001 Annex A — A.12.4.1: Event logging</w:t>
       </w:r>
     </w:p>
     <w:p>
@@ -3957,7 +4042,7 @@
     </w:p>
     <w:p>
       <w:pPr>
-        <w:spacing w:before="60" w:after="60"/>
+        <w:spacing w:before="60" w:after="60" w:line="276" w:lineRule="auto"/>
         <w:jc w:val="both"/>
         <w:rPr>
           <w:rFonts w:ascii="Times New Roman" w:hAnsi="Times New Roman" w:cs="Times New Roman"/>
@@ -3976,12 +4061,8 @@
     </w:p>
     <w:p>
       <w:pPr>
-        <w:spacing w:before="60" w:after="60"/>
-      </w:pPr>
-    </w:p>
-    <w:p>
-      <w:pPr>
         <w:pStyle w:val="Heading2"/>
+        <w:spacing w:line="276" w:lineRule="auto"/>
         <w:rPr>
           <w:rFonts w:ascii="Times New Roman" w:hAnsi="Times New Roman" w:cs="Times New Roman"/>
           <w:sz w:val="28"/>
@@ -4012,58 +4093,92 @@
         </w:rPr>
         <w:t xml:space="preserve"> Disable Password Saving in Shared Browsers</w:t>
       </w:r>
-    </w:p>
-    <w:p>
-      <w:pPr>
-        <w:spacing w:before="60" w:after="60"/>
-        <w:jc w:val="both"/>
-        <w:rPr>
-          <w:rFonts w:ascii="Times New Roman" w:hAnsi="Times New Roman" w:cs="Times New Roman"/>
-          <w:sz w:val="24"/>
-          <w:szCs w:val="24"/>
-        </w:rPr>
-      </w:pPr>
-      <w:r>
-        <w:rPr>
-          <w:rFonts w:ascii="Times New Roman" w:hAnsi="Times New Roman" w:cs="Times New Roman"/>
-          <w:sz w:val="24"/>
-          <w:szCs w:val="24"/>
-        </w:rPr>
-        <w:t>Browsers on institutional shared systems should not allow password saving or auto-login features. This reduces the risk of credential exposure.</w:t>
-      </w:r>
-    </w:p>
-    <w:p>
-      <w:pPr>
-        <w:pStyle w:val="Heading2"/>
+      <w:r>
         <w:rPr>
           <w:rFonts w:ascii="Times New Roman" w:hAnsi="Times New Roman" w:cs="Times New Roman"/>
           <w:sz w:val="28"/>
           <w:szCs w:val="28"/>
         </w:rPr>
-      </w:pPr>
+        <w:t xml:space="preserve"> </w:t>
+      </w:r>
       <w:r>
         <w:rPr>
           <w:rFonts w:ascii="Times New Roman" w:hAnsi="Times New Roman" w:cs="Times New Roman"/>
           <w:sz w:val="28"/>
           <w:szCs w:val="28"/>
         </w:rPr>
-        <w:t>8.</w:t>
-      </w:r>
-      <w:r>
+        <w:t>ISO 27001 Annex A — A.9.2.4: Management of secret authentication information</w:t>
+      </w:r>
+    </w:p>
+    <w:p>
+      <w:pPr>
+        <w:spacing w:before="60" w:after="60" w:line="276" w:lineRule="auto"/>
+        <w:jc w:val="both"/>
+        <w:rPr>
+          <w:rFonts w:ascii="Times New Roman" w:hAnsi="Times New Roman" w:cs="Times New Roman"/>
+          <w:sz w:val="24"/>
+          <w:szCs w:val="24"/>
+        </w:rPr>
+      </w:pPr>
+      <w:r>
+        <w:rPr>
+          <w:rFonts w:ascii="Times New Roman" w:hAnsi="Times New Roman" w:cs="Times New Roman"/>
+          <w:sz w:val="24"/>
+          <w:szCs w:val="24"/>
+        </w:rPr>
+        <w:t>Browsers on institutional shared systems should not allow password saving or auto-login features. This reduces the risk of credential exposure.</w:t>
+      </w:r>
+    </w:p>
+    <w:p>
+      <w:pPr>
+        <w:pStyle w:val="Heading2"/>
+        <w:spacing w:line="276" w:lineRule="auto"/>
         <w:rPr>
           <w:rFonts w:ascii="Times New Roman" w:hAnsi="Times New Roman" w:cs="Times New Roman"/>
           <w:sz w:val="28"/>
           <w:szCs w:val="28"/>
         </w:rPr>
-        <w:t>6</w:t>
-      </w:r>
+      </w:pPr>
       <w:r>
         <w:rPr>
           <w:rFonts w:ascii="Times New Roman" w:hAnsi="Times New Roman" w:cs="Times New Roman"/>
           <w:sz w:val="28"/>
           <w:szCs w:val="28"/>
         </w:rPr>
+        <w:lastRenderedPageBreak/>
+        <w:t>8.</w:t>
+      </w:r>
+      <w:r>
+        <w:rPr>
+          <w:rFonts w:ascii="Times New Roman" w:hAnsi="Times New Roman" w:cs="Times New Roman"/>
+          <w:sz w:val="28"/>
+          <w:szCs w:val="28"/>
+        </w:rPr>
+        <w:t>6</w:t>
+      </w:r>
+      <w:r>
+        <w:rPr>
+          <w:rFonts w:ascii="Times New Roman" w:hAnsi="Times New Roman" w:cs="Times New Roman"/>
+          <w:sz w:val="28"/>
+          <w:szCs w:val="28"/>
+        </w:rPr>
         <w:t xml:space="preserve"> Security Awareness Training</w:t>
+      </w:r>
+      <w:r>
+        <w:rPr>
+          <w:rFonts w:ascii="Times New Roman" w:hAnsi="Times New Roman" w:cs="Times New Roman"/>
+          <w:sz w:val="28"/>
+          <w:szCs w:val="28"/>
+        </w:rPr>
+        <w:t xml:space="preserve"> </w:t>
+      </w:r>
+      <w:r>
+        <w:rPr>
+          <w:rFonts w:ascii="Times New Roman" w:hAnsi="Times New Roman" w:cs="Times New Roman"/>
+          <w:sz w:val="28"/>
+          <w:szCs w:val="28"/>
+        </w:rPr>
+        <w:t>ISO 27001 Annex A — A.7.2.2: Information security awareness and training</w:t>
       </w:r>
     </w:p>
     <w:p>
@@ -4156,7 +4271,7 @@
     </w:p>
     <w:p>
       <w:pPr>
-        <w:spacing w:before="60" w:after="60"/>
+        <w:spacing w:before="60" w:after="60" w:line="276" w:lineRule="auto"/>
         <w:jc w:val="both"/>
         <w:rPr>
           <w:rFonts w:ascii="Times New Roman" w:hAnsi="Times New Roman" w:cs="Times New Roman"/>
@@ -4197,7 +4312,6 @@
         <w:rPr>
           <w:rFonts w:ascii="Times New Roman" w:hAnsi="Times New Roman" w:cs="Times New Roman"/>
         </w:rPr>
-        <w:lastRenderedPageBreak/>
         <w:t>9. Conclusion</w:t>
       </w:r>
     </w:p>

</xml_diff>